<commit_message>
Add hotel departure point at start of each day (day 2-5) in docx
</commit_message>
<xml_diff>
--- a/lichtrinhmalaysia2025.docx
+++ b/lichtrinhmalaysia2025.docx
@@ -2149,6 +2149,192 @@
       <w:tr>
         <w:tc>
           <w:tcPr>
+            <w:vMerge w:val="continue"/>
+            <w:tcBorders>
+              <w:top w:val="single" w:color="CCCCCC" w:sz="1"/>
+              <w:left w:val="single" w:color="CCCCCC" w:sz="1"/>
+              <w:bottom w:val="single" w:color="CCCCCC" w:sz="1"/>
+              <w:right w:val="single" w:color="CCCCCC" w:sz="1"/>
+            </w:tcBorders>
+          </w:tcPr>
+          <w:p>
+            <w:r>
+              <w:t/>
+            </w:r>
+          </w:p>
+        </w:tc>
+        <w:tc>
+          <w:tcPr>
+            <w:tcW w:type="dxa" w:w="980"/>
+            <w:tcBorders>
+              <w:top w:val="single" w:color="CCCCCC" w:sz="1"/>
+              <w:left w:val="single" w:color="CCCCCC" w:sz="1"/>
+              <w:bottom w:val="single" w:color="CCCCCC" w:sz="1"/>
+              <w:right w:val="single" w:color="CCCCCC" w:sz="1"/>
+            </w:tcBorders>
+            <w:shd w:fill="F8FBFE" w:val="clear"/>
+            <w:tcMar>
+              <w:top w:type="dxa" w:w="80"/>
+              <w:left w:type="dxa" w:w="120"/>
+              <w:bottom w:type="dxa" w:w="80"/>
+              <w:right w:type="dxa" w:w="120"/>
+            </w:tcMar>
+            <w:vAlign w:val="top"/>
+          </w:tcPr>
+          <w:p>
+            <w:r>
+              <w:t>06:00</w:t>
+            </w:r>
+          </w:p>
+        </w:tc>
+        <w:tc>
+          <w:tcPr>
+            <w:tcW w:type="dxa" w:w="2100"/>
+            <w:tcBorders>
+              <w:top w:val="single" w:color="CCCCCC" w:sz="1"/>
+              <w:left w:val="single" w:color="CCCCCC" w:sz="1"/>
+              <w:bottom w:val="single" w:color="CCCCCC" w:sz="1"/>
+              <w:right w:val="single" w:color="CCCCCC" w:sz="1"/>
+            </w:tcBorders>
+            <w:shd w:fill="F8FBFE" w:val="clear"/>
+            <w:tcMar>
+              <w:top w:type="dxa" w:w="80"/>
+              <w:left w:type="dxa" w:w="120"/>
+              <w:bottom w:type="dxa" w:w="80"/>
+              <w:right w:type="dxa" w:w="120"/>
+            </w:tcMar>
+            <w:vAlign w:val="top"/>
+          </w:tcPr>
+          <w:p>
+            <w:r>
+              <w:t>🏨 Xuất phát – Kingston Hotel 9</w:t>
+            </w:r>
+          </w:p>
+        </w:tc>
+        <w:tc>
+          <w:tcPr>
+            <w:tcW w:type="dxa" w:w="2600"/>
+            <w:tcBorders>
+              <w:top w:val="single" w:color="CCCCCC" w:sz="1"/>
+              <w:left w:val="single" w:color="CCCCCC" w:sz="1"/>
+              <w:bottom w:val="single" w:color="CCCCCC" w:sz="1"/>
+              <w:right w:val="single" w:color="CCCCCC" w:sz="1"/>
+            </w:tcBorders>
+            <w:shd w:fill="E6F0FC" w:val="clear"/>
+            <w:tcMar>
+              <w:top w:type="dxa" w:w="80"/>
+              <w:left w:type="dxa" w:w="120"/>
+              <w:bottom w:type="dxa" w:w="80"/>
+              <w:right w:type="dxa" w:w="120"/>
+            </w:tcMar>
+            <w:vAlign w:val="top"/>
+          </w:tcPr>
+          <w:p>
+            <w:r>
+              <w:t>📍 108 Jln Bunga Raya, Kampung Jawa, Melaka. Grab đến Melaka Straits Mosque ~15 phút</w:t>
+            </w:r>
+          </w:p>
+        </w:tc>
+        <w:tc>
+          <w:tcPr>
+            <w:tcW w:type="dxa" w:w="1000"/>
+            <w:tcBorders>
+              <w:top w:val="single" w:color="CCCCCC" w:sz="1"/>
+              <w:left w:val="single" w:color="CCCCCC" w:sz="1"/>
+              <w:bottom w:val="single" w:color="CCCCCC" w:sz="1"/>
+              <w:right w:val="single" w:color="CCCCCC" w:sz="1"/>
+            </w:tcBorders>
+            <w:shd w:fill="F8FBFE" w:val="clear"/>
+            <w:tcMar>
+              <w:top w:type="dxa" w:w="80"/>
+              <w:left w:type="dxa" w:w="120"/>
+              <w:bottom w:type="dxa" w:w="80"/>
+              <w:right w:type="dxa" w:w="120"/>
+            </w:tcMar>
+            <w:vAlign w:val="top"/>
+          </w:tcPr>
+          <w:p>
+            <w:r>
+              <w:t>Grab</w:t>
+            </w:r>
+          </w:p>
+        </w:tc>
+        <w:tc>
+          <w:tcPr>
+            <w:tcW w:type="dxa" w:w="880"/>
+            <w:tcBorders>
+              <w:top w:val="single" w:color="CCCCCC" w:sz="1"/>
+              <w:left w:val="single" w:color="CCCCCC" w:sz="1"/>
+              <w:bottom w:val="single" w:color="CCCCCC" w:sz="1"/>
+              <w:right w:val="single" w:color="CCCCCC" w:sz="1"/>
+            </w:tcBorders>
+            <w:shd w:fill="F8FBFE" w:val="clear"/>
+            <w:tcMar>
+              <w:top w:type="dxa" w:w="80"/>
+              <w:left w:type="dxa" w:w="120"/>
+              <w:bottom w:type="dxa" w:w="80"/>
+              <w:right w:type="dxa" w:w="120"/>
+            </w:tcMar>
+            <w:vAlign w:val="top"/>
+          </w:tcPr>
+          <w:p>
+            <w:r>
+              <w:t>–</w:t>
+            </w:r>
+          </w:p>
+        </w:tc>
+        <w:tc>
+          <w:tcPr>
+            <w:tcW w:type="dxa" w:w="980"/>
+            <w:tcBorders>
+              <w:top w:val="single" w:color="CCCCCC" w:sz="1"/>
+              <w:left w:val="single" w:color="CCCCCC" w:sz="1"/>
+              <w:bottom w:val="single" w:color="CCCCCC" w:sz="1"/>
+              <w:right w:val="single" w:color="CCCCCC" w:sz="1"/>
+            </w:tcBorders>
+            <w:shd w:fill="E8F8E8" w:val="clear"/>
+            <w:tcMar>
+              <w:top w:type="dxa" w:w="80"/>
+              <w:left w:type="dxa" w:w="120"/>
+              <w:bottom w:type="dxa" w:w="80"/>
+              <w:right w:type="dxa" w:w="120"/>
+            </w:tcMar>
+            <w:vAlign w:val="top"/>
+          </w:tcPr>
+          <w:p>
+            <w:r>
+              <w:t>–</w:t>
+            </w:r>
+          </w:p>
+        </w:tc>
+        <w:tc>
+          <w:tcPr>
+            <w:tcW w:type="dxa" w:w="1960"/>
+            <w:tcBorders>
+              <w:top w:val="single" w:color="CCCCCC" w:sz="1"/>
+              <w:left w:val="single" w:color="CCCCCC" w:sz="1"/>
+              <w:bottom w:val="single" w:color="CCCCCC" w:sz="1"/>
+              <w:right w:val="single" w:color="CCCCCC" w:sz="1"/>
+            </w:tcBorders>
+            <w:shd w:fill="F8FBFE" w:val="clear"/>
+            <w:tcMar>
+              <w:top w:type="dxa" w:w="80"/>
+              <w:left w:type="dxa" w:w="120"/>
+              <w:bottom w:type="dxa" w:w="80"/>
+              <w:right w:type="dxa" w:w="120"/>
+            </w:tcMar>
+            <w:vAlign w:val="top"/>
+          </w:tcPr>
+          <w:p>
+            <w:r>
+              <w:t>Điểm xuất phát ngày 2. Chuẩn bị trang phục kín đáo cho nhà thờ HG</w:t>
+            </w:r>
+          </w:p>
+        </w:tc>
+      </w:tr>
+      <w:tr>
+        <w:tc>
+          <w:tcPr>
             <w:tcW w:type="dxa" w:w="1100"/>
             <w:vMerge w:val="restart"/>
             <w:tcBorders>
@@ -4208,6 +4394,192 @@
       <w:tr>
         <w:tc>
           <w:tcPr>
+            <w:vMerge w:val="continue"/>
+            <w:tcBorders>
+              <w:top w:val="single" w:color="CCCCCC" w:sz="1"/>
+              <w:left w:val="single" w:color="CCCCCC" w:sz="1"/>
+              <w:bottom w:val="single" w:color="CCCCCC" w:sz="1"/>
+              <w:right w:val="single" w:color="CCCCCC" w:sz="1"/>
+            </w:tcBorders>
+          </w:tcPr>
+          <w:p>
+            <w:r>
+              <w:t/>
+            </w:r>
+          </w:p>
+        </w:tc>
+        <w:tc>
+          <w:tcPr>
+            <w:tcW w:type="dxa" w:w="980"/>
+            <w:tcBorders>
+              <w:top w:val="single" w:color="CCCCCC" w:sz="1"/>
+              <w:left w:val="single" w:color="CCCCCC" w:sz="1"/>
+              <w:bottom w:val="single" w:color="CCCCCC" w:sz="1"/>
+              <w:right w:val="single" w:color="CCCCCC" w:sz="1"/>
+            </w:tcBorders>
+            <w:shd w:fill="F8FBFE" w:val="clear"/>
+            <w:tcMar>
+              <w:top w:type="dxa" w:w="80"/>
+              <w:left w:type="dxa" w:w="120"/>
+              <w:bottom w:type="dxa" w:w="80"/>
+              <w:right w:type="dxa" w:w="120"/>
+            </w:tcMar>
+            <w:vAlign w:val="top"/>
+          </w:tcPr>
+          <w:p>
+            <w:r>
+              <w:t>08:00</w:t>
+            </w:r>
+          </w:p>
+        </w:tc>
+        <w:tc>
+          <w:tcPr>
+            <w:tcW w:type="dxa" w:w="2100"/>
+            <w:tcBorders>
+              <w:top w:val="single" w:color="CCCCCC" w:sz="1"/>
+              <w:left w:val="single" w:color="CCCCCC" w:sz="1"/>
+              <w:bottom w:val="single" w:color="CCCCCC" w:sz="1"/>
+              <w:right w:val="single" w:color="CCCCCC" w:sz="1"/>
+            </w:tcBorders>
+            <w:shd w:fill="F8FBFE" w:val="clear"/>
+            <w:tcMar>
+              <w:top w:type="dxa" w:w="80"/>
+              <w:left w:type="dxa" w:w="120"/>
+              <w:bottom w:type="dxa" w:w="80"/>
+              <w:right w:type="dxa" w:w="120"/>
+            </w:tcMar>
+            <w:vAlign w:val="top"/>
+          </w:tcPr>
+          <w:p>
+            <w:r>
+              <w:t>🏨 Xuất phát – Muari Boutique Hotel</w:t>
+            </w:r>
+          </w:p>
+        </w:tc>
+        <w:tc>
+          <w:tcPr>
+            <w:tcW w:type="dxa" w:w="2600"/>
+            <w:tcBorders>
+              <w:top w:val="single" w:color="CCCCCC" w:sz="1"/>
+              <w:left w:val="single" w:color="CCCCCC" w:sz="1"/>
+              <w:bottom w:val="single" w:color="CCCCCC" w:sz="1"/>
+              <w:right w:val="single" w:color="CCCCCC" w:sz="1"/>
+            </w:tcBorders>
+            <w:shd w:fill="E6F0FC" w:val="clear"/>
+            <w:tcMar>
+              <w:top w:type="dxa" w:w="80"/>
+              <w:left w:type="dxa" w:w="120"/>
+              <w:bottom w:type="dxa" w:w="80"/>
+              <w:right w:type="dxa" w:w="120"/>
+            </w:tcMar>
+            <w:vAlign w:val="top"/>
+          </w:tcPr>
+          <w:p>
+            <w:r>
+              <w:t>📍 63-3 Jalan Ali, Pekan Muar, Johor. Grab đến Gunung Ledang ~45 phút</w:t>
+            </w:r>
+          </w:p>
+        </w:tc>
+        <w:tc>
+          <w:tcPr>
+            <w:tcW w:type="dxa" w:w="1000"/>
+            <w:tcBorders>
+              <w:top w:val="single" w:color="CCCCCC" w:sz="1"/>
+              <w:left w:val="single" w:color="CCCCCC" w:sz="1"/>
+              <w:bottom w:val="single" w:color="CCCCCC" w:sz="1"/>
+              <w:right w:val="single" w:color="CCCCCC" w:sz="1"/>
+            </w:tcBorders>
+            <w:shd w:fill="F8FBFE" w:val="clear"/>
+            <w:tcMar>
+              <w:top w:type="dxa" w:w="80"/>
+              <w:left w:type="dxa" w:w="120"/>
+              <w:bottom w:type="dxa" w:w="80"/>
+              <w:right w:type="dxa" w:w="120"/>
+            </w:tcMar>
+            <w:vAlign w:val="top"/>
+          </w:tcPr>
+          <w:p>
+            <w:r>
+              <w:t>Đi bộ</w:t>
+            </w:r>
+          </w:p>
+        </w:tc>
+        <w:tc>
+          <w:tcPr>
+            <w:tcW w:type="dxa" w:w="880"/>
+            <w:tcBorders>
+              <w:top w:val="single" w:color="CCCCCC" w:sz="1"/>
+              <w:left w:val="single" w:color="CCCCCC" w:sz="1"/>
+              <w:bottom w:val="single" w:color="CCCCCC" w:sz="1"/>
+              <w:right w:val="single" w:color="CCCCCC" w:sz="1"/>
+            </w:tcBorders>
+            <w:shd w:fill="F8FBFE" w:val="clear"/>
+            <w:tcMar>
+              <w:top w:type="dxa" w:w="80"/>
+              <w:left w:type="dxa" w:w="120"/>
+              <w:bottom w:type="dxa" w:w="80"/>
+              <w:right w:type="dxa" w:w="120"/>
+            </w:tcMar>
+            <w:vAlign w:val="top"/>
+          </w:tcPr>
+          <w:p>
+            <w:r>
+              <w:t>–</w:t>
+            </w:r>
+          </w:p>
+        </w:tc>
+        <w:tc>
+          <w:tcPr>
+            <w:tcW w:type="dxa" w:w="980"/>
+            <w:tcBorders>
+              <w:top w:val="single" w:color="CCCCCC" w:sz="1"/>
+              <w:left w:val="single" w:color="CCCCCC" w:sz="1"/>
+              <w:bottom w:val="single" w:color="CCCCCC" w:sz="1"/>
+              <w:right w:val="single" w:color="CCCCCC" w:sz="1"/>
+            </w:tcBorders>
+            <w:shd w:fill="E8F8E8" w:val="clear"/>
+            <w:tcMar>
+              <w:top w:type="dxa" w:w="80"/>
+              <w:left w:type="dxa" w:w="120"/>
+              <w:bottom w:type="dxa" w:w="80"/>
+              <w:right w:type="dxa" w:w="120"/>
+            </w:tcMar>
+            <w:vAlign w:val="top"/>
+          </w:tcPr>
+          <w:p>
+            <w:r>
+              <w:t>–</w:t>
+            </w:r>
+          </w:p>
+        </w:tc>
+        <w:tc>
+          <w:tcPr>
+            <w:tcW w:type="dxa" w:w="1960"/>
+            <w:tcBorders>
+              <w:top w:val="single" w:color="CCCCCC" w:sz="1"/>
+              <w:left w:val="single" w:color="CCCCCC" w:sz="1"/>
+              <w:bottom w:val="single" w:color="CCCCCC" w:sz="1"/>
+              <w:right w:val="single" w:color="CCCCCC" w:sz="1"/>
+            </w:tcBorders>
+            <w:shd w:fill="F8FBFE" w:val="clear"/>
+            <w:tcMar>
+              <w:top w:type="dxa" w:w="80"/>
+              <w:left w:type="dxa" w:w="120"/>
+              <w:bottom w:type="dxa" w:w="80"/>
+              <w:right w:type="dxa" w:w="120"/>
+            </w:tcMar>
+            <w:vAlign w:val="top"/>
+          </w:tcPr>
+          <w:p>
+            <w:r>
+              <w:t>Điểm xuất phát ngày 3. Check-out &amp; ăn sáng trước khi đi thác</w:t>
+            </w:r>
+          </w:p>
+        </w:tc>
+      </w:tr>
+      <w:tr>
+        <w:tc>
+          <w:tcPr>
             <w:tcW w:type="dxa" w:w="1100"/>
             <w:vMerge w:val="restart"/>
             <w:tcBorders>
@@ -6021,6 +6393,192 @@
       <w:tr>
         <w:tc>
           <w:tcPr>
+            <w:vMerge w:val="continue"/>
+            <w:tcBorders>
+              <w:top w:val="single" w:color="CCCCCC" w:sz="1"/>
+              <w:left w:val="single" w:color="CCCCCC" w:sz="1"/>
+              <w:bottom w:val="single" w:color="CCCCCC" w:sz="1"/>
+              <w:right w:val="single" w:color="CCCCCC" w:sz="1"/>
+            </w:tcBorders>
+          </w:tcPr>
+          <w:p>
+            <w:r>
+              <w:t/>
+            </w:r>
+          </w:p>
+        </w:tc>
+        <w:tc>
+          <w:tcPr>
+            <w:tcW w:type="dxa" w:w="980"/>
+            <w:tcBorders>
+              <w:top w:val="single" w:color="CCCCCC" w:sz="1"/>
+              <w:left w:val="single" w:color="CCCCCC" w:sz="1"/>
+              <w:bottom w:val="single" w:color="CCCCCC" w:sz="1"/>
+              <w:right w:val="single" w:color="CCCCCC" w:sz="1"/>
+            </w:tcBorders>
+            <w:shd w:fill="F8FBFE" w:val="clear"/>
+            <w:tcMar>
+              <w:top w:type="dxa" w:w="80"/>
+              <w:left w:type="dxa" w:w="120"/>
+              <w:bottom w:type="dxa" w:w="80"/>
+              <w:right w:type="dxa" w:w="120"/>
+            </w:tcMar>
+            <w:vAlign w:val="top"/>
+          </w:tcPr>
+          <w:p>
+            <w:r>
+              <w:t>07:30</w:t>
+            </w:r>
+          </w:p>
+        </w:tc>
+        <w:tc>
+          <w:tcPr>
+            <w:tcW w:type="dxa" w:w="2100"/>
+            <w:tcBorders>
+              <w:top w:val="single" w:color="CCCCCC" w:sz="1"/>
+              <w:left w:val="single" w:color="CCCCCC" w:sz="1"/>
+              <w:bottom w:val="single" w:color="CCCCCC" w:sz="1"/>
+              <w:right w:val="single" w:color="CCCCCC" w:sz="1"/>
+            </w:tcBorders>
+            <w:shd w:fill="F8FBFE" w:val="clear"/>
+            <w:tcMar>
+              <w:top w:type="dxa" w:w="80"/>
+              <w:left w:type="dxa" w:w="120"/>
+              <w:bottom w:type="dxa" w:w="80"/>
+              <w:right w:type="dxa" w:w="120"/>
+            </w:tcMar>
+            <w:vAlign w:val="top"/>
+          </w:tcPr>
+          <w:p>
+            <w:r>
+              <w:t>🏨 Xuất phát – Hotel Transit KL</w:t>
+            </w:r>
+          </w:p>
+        </w:tc>
+        <w:tc>
+          <w:tcPr>
+            <w:tcW w:type="dxa" w:w="2600"/>
+            <w:tcBorders>
+              <w:top w:val="single" w:color="CCCCCC" w:sz="1"/>
+              <w:left w:val="single" w:color="CCCCCC" w:sz="1"/>
+              <w:bottom w:val="single" w:color="CCCCCC" w:sz="1"/>
+              <w:right w:val="single" w:color="CCCCCC" w:sz="1"/>
+            </w:tcBorders>
+            <w:shd w:fill="E6F0FC" w:val="clear"/>
+            <w:tcMar>
+              <w:top w:type="dxa" w:w="80"/>
+              <w:left w:type="dxa" w:w="120"/>
+              <w:bottom w:type="dxa" w:w="80"/>
+              <w:right w:type="dxa" w:w="120"/>
+            </w:tcMar>
+            <w:vAlign w:val="top"/>
+          </w:tcPr>
+          <w:p>
+            <w:r>
+              <w:t>📍 42 Jalan Pudu, Bukit Bintang, KL. Đi bộ/Grab ra ga KTM đến Batu Caves</w:t>
+            </w:r>
+          </w:p>
+        </w:tc>
+        <w:tc>
+          <w:tcPr>
+            <w:tcW w:type="dxa" w:w="1000"/>
+            <w:tcBorders>
+              <w:top w:val="single" w:color="CCCCCC" w:sz="1"/>
+              <w:left w:val="single" w:color="CCCCCC" w:sz="1"/>
+              <w:bottom w:val="single" w:color="CCCCCC" w:sz="1"/>
+              <w:right w:val="single" w:color="CCCCCC" w:sz="1"/>
+            </w:tcBorders>
+            <w:shd w:fill="F8FBFE" w:val="clear"/>
+            <w:tcMar>
+              <w:top w:type="dxa" w:w="80"/>
+              <w:left w:type="dxa" w:w="120"/>
+              <w:bottom w:type="dxa" w:w="80"/>
+              <w:right w:type="dxa" w:w="120"/>
+            </w:tcMar>
+            <w:vAlign w:val="top"/>
+          </w:tcPr>
+          <w:p>
+            <w:r>
+              <w:t>Đi bộ</w:t>
+            </w:r>
+          </w:p>
+        </w:tc>
+        <w:tc>
+          <w:tcPr>
+            <w:tcW w:type="dxa" w:w="880"/>
+            <w:tcBorders>
+              <w:top w:val="single" w:color="CCCCCC" w:sz="1"/>
+              <w:left w:val="single" w:color="CCCCCC" w:sz="1"/>
+              <w:bottom w:val="single" w:color="CCCCCC" w:sz="1"/>
+              <w:right w:val="single" w:color="CCCCCC" w:sz="1"/>
+            </w:tcBorders>
+            <w:shd w:fill="F8FBFE" w:val="clear"/>
+            <w:tcMar>
+              <w:top w:type="dxa" w:w="80"/>
+              <w:left w:type="dxa" w:w="120"/>
+              <w:bottom w:type="dxa" w:w="80"/>
+              <w:right w:type="dxa" w:w="120"/>
+            </w:tcMar>
+            <w:vAlign w:val="top"/>
+          </w:tcPr>
+          <w:p>
+            <w:r>
+              <w:t>–</w:t>
+            </w:r>
+          </w:p>
+        </w:tc>
+        <w:tc>
+          <w:tcPr>
+            <w:tcW w:type="dxa" w:w="980"/>
+            <w:tcBorders>
+              <w:top w:val="single" w:color="CCCCCC" w:sz="1"/>
+              <w:left w:val="single" w:color="CCCCCC" w:sz="1"/>
+              <w:bottom w:val="single" w:color="CCCCCC" w:sz="1"/>
+              <w:right w:val="single" w:color="CCCCCC" w:sz="1"/>
+            </w:tcBorders>
+            <w:shd w:fill="E8F8E8" w:val="clear"/>
+            <w:tcMar>
+              <w:top w:type="dxa" w:w="80"/>
+              <w:left w:type="dxa" w:w="120"/>
+              <w:bottom w:type="dxa" w:w="80"/>
+              <w:right w:type="dxa" w:w="120"/>
+            </w:tcMar>
+            <w:vAlign w:val="top"/>
+          </w:tcPr>
+          <w:p>
+            <w:r>
+              <w:t>–</w:t>
+            </w:r>
+          </w:p>
+        </w:tc>
+        <w:tc>
+          <w:tcPr>
+            <w:tcW w:type="dxa" w:w="1960"/>
+            <w:tcBorders>
+              <w:top w:val="single" w:color="CCCCCC" w:sz="1"/>
+              <w:left w:val="single" w:color="CCCCCC" w:sz="1"/>
+              <w:bottom w:val="single" w:color="CCCCCC" w:sz="1"/>
+              <w:right w:val="single" w:color="CCCCCC" w:sz="1"/>
+            </w:tcBorders>
+            <w:shd w:fill="F8FBFE" w:val="clear"/>
+            <w:tcMar>
+              <w:top w:type="dxa" w:w="80"/>
+              <w:left w:type="dxa" w:w="120"/>
+              <w:bottom w:type="dxa" w:w="80"/>
+              <w:right w:type="dxa" w:w="120"/>
+            </w:tcMar>
+            <w:vAlign w:val="top"/>
+          </w:tcPr>
+          <w:p>
+            <w:r>
+              <w:t>Điểm xuất phát ngày 4. Mặc quần dài qua gối cho Batu Caves</w:t>
+            </w:r>
+          </w:p>
+        </w:tc>
+      </w:tr>
+      <w:tr>
+        <w:tc>
+          <w:tcPr>
             <w:tcW w:type="dxa" w:w="1100"/>
             <w:vMerge w:val="restart"/>
             <w:tcBorders>
@@ -7542,6 +8100,192 @@
                 <w:szCs w:val="18"/>
               </w:rPr>
               <w:t xml:space="preserve">🏨 Hotel Transit KL  |  42 Jalan Pudu  |  Bukit Bintang, KL  |  (đêm 2/2)</w:t>
+            </w:r>
+          </w:p>
+        </w:tc>
+      </w:tr>
+      <w:tr>
+        <w:tc>
+          <w:tcPr>
+            <w:vMerge w:val="continue"/>
+            <w:tcBorders>
+              <w:top w:val="single" w:color="CCCCCC" w:sz="1"/>
+              <w:left w:val="single" w:color="CCCCCC" w:sz="1"/>
+              <w:bottom w:val="single" w:color="CCCCCC" w:sz="1"/>
+              <w:right w:val="single" w:color="CCCCCC" w:sz="1"/>
+            </w:tcBorders>
+          </w:tcPr>
+          <w:p>
+            <w:r>
+              <w:t/>
+            </w:r>
+          </w:p>
+        </w:tc>
+        <w:tc>
+          <w:tcPr>
+            <w:tcW w:type="dxa" w:w="980"/>
+            <w:tcBorders>
+              <w:top w:val="single" w:color="CCCCCC" w:sz="1"/>
+              <w:left w:val="single" w:color="CCCCCC" w:sz="1"/>
+              <w:bottom w:val="single" w:color="CCCCCC" w:sz="1"/>
+              <w:right w:val="single" w:color="CCCCCC" w:sz="1"/>
+            </w:tcBorders>
+            <w:shd w:fill="F8FBFE" w:val="clear"/>
+            <w:tcMar>
+              <w:top w:type="dxa" w:w="80"/>
+              <w:left w:type="dxa" w:w="120"/>
+              <w:bottom w:type="dxa" w:w="80"/>
+              <w:right w:type="dxa" w:w="120"/>
+            </w:tcMar>
+            <w:vAlign w:val="top"/>
+          </w:tcPr>
+          <w:p>
+            <w:r>
+              <w:t>08:00</w:t>
+            </w:r>
+          </w:p>
+        </w:tc>
+        <w:tc>
+          <w:tcPr>
+            <w:tcW w:type="dxa" w:w="2100"/>
+            <w:tcBorders>
+              <w:top w:val="single" w:color="CCCCCC" w:sz="1"/>
+              <w:left w:val="single" w:color="CCCCCC" w:sz="1"/>
+              <w:bottom w:val="single" w:color="CCCCCC" w:sz="1"/>
+              <w:right w:val="single" w:color="CCCCCC" w:sz="1"/>
+            </w:tcBorders>
+            <w:shd w:fill="F8FBFE" w:val="clear"/>
+            <w:tcMar>
+              <w:top w:type="dxa" w:w="80"/>
+              <w:left w:type="dxa" w:w="120"/>
+              <w:bottom w:type="dxa" w:w="80"/>
+              <w:right w:type="dxa" w:w="120"/>
+            </w:tcMar>
+            <w:vAlign w:val="top"/>
+          </w:tcPr>
+          <w:p>
+            <w:r>
+              <w:t>🏨 Xuất phát – Hotel Transit KL</w:t>
+            </w:r>
+          </w:p>
+        </w:tc>
+        <w:tc>
+          <w:tcPr>
+            <w:tcW w:type="dxa" w:w="2600"/>
+            <w:tcBorders>
+              <w:top w:val="single" w:color="CCCCCC" w:sz="1"/>
+              <w:left w:val="single" w:color="CCCCCC" w:sz="1"/>
+              <w:bottom w:val="single" w:color="CCCCCC" w:sz="1"/>
+              <w:right w:val="single" w:color="CCCCCC" w:sz="1"/>
+            </w:tcBorders>
+            <w:shd w:fill="E6F0FC" w:val="clear"/>
+            <w:tcMar>
+              <w:top w:type="dxa" w:w="80"/>
+              <w:left w:type="dxa" w:w="120"/>
+              <w:bottom w:type="dxa" w:w="80"/>
+              <w:right w:type="dxa" w:w="120"/>
+            </w:tcMar>
+            <w:vAlign w:val="top"/>
+          </w:tcPr>
+          <w:p>
+            <w:r>
+              <w:t>📍 42 Jalan Pudu, Bukit Bintang, KL. Check-out, gửi hành lý tại quầy nếu cần</w:t>
+            </w:r>
+          </w:p>
+        </w:tc>
+        <w:tc>
+          <w:tcPr>
+            <w:tcW w:type="dxa" w:w="1000"/>
+            <w:tcBorders>
+              <w:top w:val="single" w:color="CCCCCC" w:sz="1"/>
+              <w:left w:val="single" w:color="CCCCCC" w:sz="1"/>
+              <w:bottom w:val="single" w:color="CCCCCC" w:sz="1"/>
+              <w:right w:val="single" w:color="CCCCCC" w:sz="1"/>
+            </w:tcBorders>
+            <w:shd w:fill="F8FBFE" w:val="clear"/>
+            <w:tcMar>
+              <w:top w:type="dxa" w:w="80"/>
+              <w:left w:type="dxa" w:w="120"/>
+              <w:bottom w:type="dxa" w:w="80"/>
+              <w:right w:type="dxa" w:w="120"/>
+            </w:tcMar>
+            <w:vAlign w:val="top"/>
+          </w:tcPr>
+          <w:p>
+            <w:r>
+              <w:t>Đi bộ</w:t>
+            </w:r>
+          </w:p>
+        </w:tc>
+        <w:tc>
+          <w:tcPr>
+            <w:tcW w:type="dxa" w:w="880"/>
+            <w:tcBorders>
+              <w:top w:val="single" w:color="CCCCCC" w:sz="1"/>
+              <w:left w:val="single" w:color="CCCCCC" w:sz="1"/>
+              <w:bottom w:val="single" w:color="CCCCCC" w:sz="1"/>
+              <w:right w:val="single" w:color="CCCCCC" w:sz="1"/>
+            </w:tcBorders>
+            <w:shd w:fill="F8FBFE" w:val="clear"/>
+            <w:tcMar>
+              <w:top w:type="dxa" w:w="80"/>
+              <w:left w:type="dxa" w:w="120"/>
+              <w:bottom w:type="dxa" w:w="80"/>
+              <w:right w:type="dxa" w:w="120"/>
+            </w:tcMar>
+            <w:vAlign w:val="top"/>
+          </w:tcPr>
+          <w:p>
+            <w:r>
+              <w:t>–</w:t>
+            </w:r>
+          </w:p>
+        </w:tc>
+        <w:tc>
+          <w:tcPr>
+            <w:tcW w:type="dxa" w:w="980"/>
+            <w:tcBorders>
+              <w:top w:val="single" w:color="CCCCCC" w:sz="1"/>
+              <w:left w:val="single" w:color="CCCCCC" w:sz="1"/>
+              <w:bottom w:val="single" w:color="CCCCCC" w:sz="1"/>
+              <w:right w:val="single" w:color="CCCCCC" w:sz="1"/>
+            </w:tcBorders>
+            <w:shd w:fill="E8F8E8" w:val="clear"/>
+            <w:tcMar>
+              <w:top w:type="dxa" w:w="80"/>
+              <w:left w:type="dxa" w:w="120"/>
+              <w:bottom w:type="dxa" w:w="80"/>
+              <w:right w:type="dxa" w:w="120"/>
+            </w:tcMar>
+            <w:vAlign w:val="top"/>
+          </w:tcPr>
+          <w:p>
+            <w:r>
+              <w:t>–</w:t>
+            </w:r>
+          </w:p>
+        </w:tc>
+        <w:tc>
+          <w:tcPr>
+            <w:tcW w:type="dxa" w:w="1960"/>
+            <w:tcBorders>
+              <w:top w:val="single" w:color="CCCCCC" w:sz="1"/>
+              <w:left w:val="single" w:color="CCCCCC" w:sz="1"/>
+              <w:bottom w:val="single" w:color="CCCCCC" w:sz="1"/>
+              <w:right w:val="single" w:color="CCCCCC" w:sz="1"/>
+            </w:tcBorders>
+            <w:shd w:fill="F8FBFE" w:val="clear"/>
+            <w:tcMar>
+              <w:top w:type="dxa" w:w="80"/>
+              <w:left w:type="dxa" w:w="120"/>
+              <w:bottom w:type="dxa" w:w="80"/>
+              <w:right w:type="dxa" w:w="120"/>
+            </w:tcMar>
+            <w:vAlign w:val="top"/>
+          </w:tcPr>
+          <w:p>
+            <w:r>
+              <w:t>Điểm xuất phát ngày 5. Check-out trước khi ra ăn sáng Roti Canai</w:t>
             </w:r>
           </w:p>
         </w:tc>

</xml_diff>